<commit_message>
docs: rewrite IEEE report to match actual code and logs
</commit_message>
<xml_diff>
--- a/docs/relatorio/relatorio_spin.docx
+++ b/docs/relatorio/relatorio_spin.docx
@@ -15,7 +15,7 @@
           <w:sz w:val="20"/>
           <w:szCs w:val="20"/>
         </w:rPr>
-        <w:t xml:space="preserve">Simulação de Rede em Chip SPIN com SystemC</w:t>
+        <w:t>Simulação de Rede em Chip SPIN com SystemC</w:t>
       </w:r>
     </w:p>
     <w:p>
@@ -32,7 +32,7 @@
           <w:sz w:val="20"/>
           <w:szCs w:val="20"/>
         </w:rPr>
-        <w:t xml:space="preserve">Flavio Oliveira Silva Junior, Leonardo Machado Moreira, Claudivan Costa de Lima Junior</w:t>
+        <w:t>Flavio Oliveira Silva Junior, Leonardo Machado Moreira, Claudivan Costa de Lima Junior</w:t>
       </w:r>
     </w:p>
     <w:p>
@@ -47,7 +47,7 @@
           <w:sz w:val="18"/>
           <w:szCs w:val="18"/>
         </w:rPr>
-        <w:t xml:space="preserve">Departamento de Informática e Matemática Aplicada — UFRN, Natal, Brasil</w:t>
+        <w:t>Departamento de Informática e Matemática Aplicada, UFRN, Natal, Brasil</w:t>
       </w:r>
     </w:p>
     <w:p>
@@ -62,7 +62,6 @@
           <w:sz w:val="20"/>
           <w:szCs w:val="20"/>
         </w:rPr>
-        <w:t xml:space="preserve"/>
       </w:r>
     </w:p>
     <w:p>
@@ -79,15 +78,14 @@
           <w:sz w:val="20"/>
           <w:szCs w:val="20"/>
         </w:rPr>
-        <w:t xml:space="preserve">Resumo — </w:t>
-      </w:r>
-      <w:r>
-        <w:rPr>
-          <w:rFonts w:ascii="Times New Roman" w:cs="Times New Roman" w:eastAsia="Times New Roman" w:hAnsi="Times New Roman"/>
-          <w:sz w:val="20"/>
-          <w:szCs w:val="20"/>
-        </w:rPr>
-        <w:t xml:space="preserve">Este trabalho apresenta o desenvolvimento de um simulador de Rede em Chip (Network-on-Chip – NoC) baseado na arquitetura SPIN (Scalable Programmable Integrated Network), implementado em C++17 com SystemC 3.0. A rede é composta por 8 roteadores RSPIN organizados em topologia de árvore gorda quaternária de 2 níveis e 16 terminais. O simulador implementa chaveamento Wormhole, roteamento adaptativo na subida da árvore e determinístico na descida, controle de fluxo baseado em créditos e arbitragem Round-Robin. Os resultados de simulação demonstraram latência constante de 3 ciclos por pacote, 2 saltos por mensagem e taxa de entrega de 100%, validando a corretude da implementação.</w:t>
+        <w:t>Resumo: Este trabalho apresenta o desenvolvimento de um simulador de Rede em Chip (Network-on-Chip, NoC) inspirado na arquitetura SPIN (Scalable Programmable Integrated Network), implementado em C++17 com SystemC. A rede é composta por 8 roteadores RSPIN organizados em uma topologia de árvore gorda quaternária simplificada de 2 níveis e 16 terminais. O simulador representa os pacotes em nível abstrato, usando terminais de origem e destino, buffers por porta, buffers centrais de overflow e controle de fluxo simplificado por capacidade de buffer. Os resultados do cenário principal demonstraram entrega de 100% dos pacotes, latência de 3 ciclos por pacote, 2 saltos de roteamento por mensagem e parada antecipada da simulação quando a rede ficou vazia.</w:t>
+      </w:r>
+      <w:r>
+        <w:rPr>
+          <w:rFonts w:ascii="Times New Roman" w:cs="Times New Roman" w:eastAsia="Times New Roman" w:hAnsi="Times New Roman"/>
+          <w:sz w:val="20"/>
+          <w:szCs w:val="20"/>
+        </w:rPr>
       </w:r>
     </w:p>
     <w:p>
@@ -103,7 +101,7 @@
           <w:sz w:val="20"/>
           <w:szCs w:val="20"/>
         </w:rPr>
-        <w:t xml:space="preserve">Palavras-chave: </w:t>
+        <w:t>Palavras-chave: Network-on-Chip; SPIN; árvore gorda quaternária; SystemC; simulação ciclo a ciclo; topologia K4,4.</w:t>
       </w:r>
       <w:r>
         <w:rPr>
@@ -113,7 +111,6 @@
           <w:sz w:val="20"/>
           <w:szCs w:val="20"/>
         </w:rPr>
-        <w:t xml:space="preserve">Network-on-Chip; SPIN; árvore gorda quaternária; SystemC; Wormhole; controle de fluxo por créditos.</w:t>
       </w:r>
     </w:p>
     <w:p>
@@ -143,7 +140,7 @@
           <w:sz w:val="20"/>
           <w:szCs w:val="20"/>
         </w:rPr>
-        <w:t xml:space="preserve">I. INTRODUÇÃO</w:t>
+        <w:t>I. INTRODUÇÃO</w:t>
       </w:r>
     </w:p>
     <w:p>
@@ -158,7 +155,7 @@
           <w:sz w:val="20"/>
           <w:szCs w:val="20"/>
         </w:rPr>
-        <w:t xml:space="preserve">Com o aumento da complexidade dos sistemas integrados, os barramentos tradicionais passaram a apresentar limitações de escalabilidade, compartilhamento do meio e desempenho. As Redes em Chip (Network-on-Chip – NoC) surgiram como solução, interligando processadores, memórias e periféricos por meio de roteadores e enlaces dedicados, permitindo comunicações simultâneas e maior eficiência [1].</w:t>
+        <w:t>Com o aumento da complexidade dos sistemas integrados, os barramentos tradicionais passaram a apresentar limitações de escalabilidade, compartilhamento do meio e desempenho. As Redes em Chip (Network-on-Chip - NoC) surgiram como solução, interligando processadores, memórias e periféricos por meio de roteadores e enlaces dedicados, permitindo comunicações simultâneas e maior eficiência [1].</w:t>
       </w:r>
     </w:p>
     <w:p>
@@ -173,7 +170,6 @@
           <w:sz w:val="20"/>
           <w:szCs w:val="20"/>
         </w:rPr>
-        <w:t xml:space="preserve"/>
       </w:r>
     </w:p>
     <w:p>
@@ -188,7 +184,7 @@
           <w:sz w:val="20"/>
           <w:szCs w:val="20"/>
         </w:rPr>
-        <w:t xml:space="preserve">A arquitetura SPIN (Scalable Programmable Integrated Network) destaca-se pela organização em árvore gorda (fat-tree) e pelo uso de comunicação baseada em pacotes, com baixa latência, boa escalabilidade e mecanismos eficientes de roteamento e controle de fluxo [2]. Desenvolvida no LIP6/ASIM (Paris), a SPIN define roteadores RSPIN com portas inferiores (DN, conectadas a terminais ou roteadores filhos) e superiores (UP, conectadas ao roteador pai), formando uma hierarquia que elimina gargalos de barramento.</w:t>
+        <w:t>A arquitetura SPIN (Scalable Programmable Integrated Network) destaca-se pela organização em árvore gorda (fat-tree) e pelo uso de comunicação baseada em pacotes, com baixa latência, boa escalabilidade e mecanismos eficientes de roteamento e controle de fluxo [2]. Desenvolvida no LIP6/ASIM (Paris), a SPIN define roteadores RSPIN com portas inferiores (DN, conectadas a terminais ou roteadores filhos) e superiores (UP, conectadas ao roteador pai), formando uma hierarquia que elimina gargalos de barramento.</w:t>
       </w:r>
     </w:p>
     <w:p>
@@ -203,7 +199,6 @@
           <w:sz w:val="20"/>
           <w:szCs w:val="20"/>
         </w:rPr>
-        <w:t xml:space="preserve"/>
       </w:r>
     </w:p>
     <w:p>
@@ -218,7 +213,7 @@
           <w:sz w:val="20"/>
           <w:szCs w:val="20"/>
         </w:rPr>
-        <w:t xml:space="preserve">Este trabalho apresenta o desenvolvimento de um simulador da rede SPIN em SystemC, composto por 8 roteadores em topologia de árvore gorda quaternária e 16 terminais. O simulador lê eventos de tráfego, injeta pacotes na rede e simula sua propagação ciclo a ciclo, produzindo um log com latências, rotas e estatísticas de desempenho.</w:t>
+        <w:t>Este trabalho apresenta o desenvolvimento de um simulador da rede SPIN em SystemC [4], composto por 8 roteadores em topologia de árvore gorda quaternária simplificada e 16 terminais. O simulador lê a topologia e os eventos de tráfego a partir de arquivos texto, injeta pacotes na rede e simula sua propagação ciclo a ciclo, produzindo logs com rotas, latências, pacotes pendentes e estatísticas de desempenho.</w:t>
       </w:r>
     </w:p>
     <w:p>
@@ -234,7 +229,7 @@
           <w:sz w:val="20"/>
           <w:szCs w:val="20"/>
         </w:rPr>
-        <w:t xml:space="preserve">II. REFERENCIAL TEÓRICO</w:t>
+        <w:t>II. REFERENCIAL TEÓRICO</w:t>
       </w:r>
     </w:p>
     <w:p>
@@ -252,7 +247,7 @@
           <w:sz w:val="20"/>
           <w:szCs w:val="20"/>
         </w:rPr>
-        <w:t xml:space="preserve">A. Redes em Chip (NoC)</w:t>
+        <w:t>A. Redes em Chip (NoC)</w:t>
       </w:r>
     </w:p>
     <w:p>
@@ -267,7 +262,7 @@
           <w:sz w:val="20"/>
           <w:szCs w:val="20"/>
         </w:rPr>
-        <w:t xml:space="preserve">As NoCs substituem barramentos compartilhados por redes de interconexão com roteadores e enlaces dedicados, permitindo múltiplas comunicações simultâneas. Isso aumenta a largura de banda efetiva e reduz a latência em chips multiprocessados modernos [1].</w:t>
+        <w:t>As NoCs substituem barramentos compartilhados por redes de interconexão com roteadores e enlaces dedicados, permitindo múltiplas comunicações simultâneas. Isso aumenta a largura de banda efetiva e reduz a latência em chips multiprocessados modernos [1].</w:t>
       </w:r>
     </w:p>
     <w:p>
@@ -285,7 +280,7 @@
           <w:sz w:val="20"/>
           <w:szCs w:val="20"/>
         </w:rPr>
-        <w:t xml:space="preserve">B. Arquitetura SPIN e Árvore Gorda</w:t>
+        <w:t>B. Arquitetura SPIN e Árvore Gorda</w:t>
       </w:r>
     </w:p>
     <w:p>
@@ -300,7 +295,7 @@
           <w:sz w:val="20"/>
           <w:szCs w:val="20"/>
         </w:rPr>
-        <w:t xml:space="preserve">A arquitetura SPIN organiza seus roteadores em uma árvore gorda quaternária. Em uma árvore gorda, os enlances próximos à raiz têm maior capacidade agregada do que em uma árvore convencional, evitando gargalo no topo da hierarquia [2]. Na configuração de 8 roteadores com 4 portas cada, a rede é estruturada em dois níveis: quatro roteadores folha (R0–R3), cada um conectado a quatro terminais, e quatro roteadores de topo (R4–R7), cada um interligado a todos os roteadores folha. A conectividade é total entre os dois níveis: cada folha Ri conecta suas portas U0–U3 respectivamente a R4, R5, R6 e R7; cada topo R(4+j) conecta sua porta Dj ao roteador folha Rj.</w:t>
+        <w:t>A arquitetura SPIN organiza seus roteadores em uma árvore gorda quaternária. Em uma árvore gorda, os enlaces próximos à raiz têm maior capacidade agregada do que em uma árvore convencional, evitando gargalo no topo da hierarquia [2]. Na configuração simplificada de 8 roteadores usada neste trabalho, a rede é estruturada em dois níveis: quatro roteadores folha (R0-R3), cada um conectado a quatro terminais, e quatro roteadores de topo (R4-R7), cada um interligado a todos os roteadores folha. A conectividade é total entre os dois níveis: cada folha Ri conecta suas portas U0-U3 respectivamente a R4, R5, R6 e R7; cada topo R(4+j) conecta sua porta Dj ao roteador folha Rj.</w:t>
       </w:r>
     </w:p>
     <w:p>
@@ -318,7 +313,7 @@
           <w:sz w:val="20"/>
           <w:szCs w:val="20"/>
         </w:rPr>
-        <w:t xml:space="preserve">C. Chaveamento Wormhole</w:t>
+        <w:t>C. Chaveamento Wormhole</w:t>
       </w:r>
     </w:p>
     <w:p>
@@ -333,7 +328,7 @@
           <w:sz w:val="20"/>
           <w:szCs w:val="20"/>
         </w:rPr>
-        <w:t xml:space="preserve">No chaveamento Wormhole, o pacote é dividido em flits. O header flit reserva o caminho desde a origem até o destino, e os flits subsequentes seguem pela mesma rota sem necessidade de armazenamento completo em cada roteador. Isso reduz substancialmente a latência em comparação ao modo store-and-forward, no qual o pacote inteiro precisa ser armazenado antes de ser retransmitido [3].</w:t>
+        <w:t>No chaveamento Wormhole, o pacote é dividido em flits. O header flit reserva o caminho desde a origem até o destino, e os flits subsequentes seguem pela mesma rota sem necessidade de armazenamento completo em cada roteador. Isso reduz a latência em comparação ao modo store-and-forward, no qual o pacote inteiro precisa ser armazenado antes de ser retransmitido [3]. No modelo implementado neste trabalho, esse mecanismo é usado como referência conceitual, mas os pacotes são tratados como unidades atômicas, sem modelagem de flits individuais.</w:t>
       </w:r>
     </w:p>
     <w:p>
@@ -351,7 +346,7 @@
           <w:sz w:val="20"/>
           <w:szCs w:val="20"/>
         </w:rPr>
-        <w:t xml:space="preserve">D. Roteamento Adaptativo e Determinístico</w:t>
+        <w:t>D. Roteamento Adaptativo e Determinístico</w:t>
       </w:r>
     </w:p>
     <w:p>
@@ -366,7 +361,7 @@
           <w:sz w:val="20"/>
           <w:szCs w:val="20"/>
         </w:rPr>
-        <w:t xml:space="preserve">A SPIN emprega roteamento híbrido. Na subida (folha→topo), o roteamento é adaptativo: a porta upper com mais créditos disponíveis é escolhida, funcionando como proxy para o canal menos ocupado. Na descida (topo→folha), o roteamento é determinístico: existe apenas um roteador folha possível para dado destino. Essa combinação garante ausência de deadlock, pois os pacotes percorrem o grafo em sentido único [2].</w:t>
+        <w:t>A SPIN emprega roteamento híbrido. Na subida (folha para topo), o roteamento pode escolher entre portas superiores disponíveis, enquanto na descida (topo para folha) o destino determina o roteador folha a ser alcançado [2]. Neste simulador, essa ideia é representada por uma política simplificada: a subida escolhe um roteador de topo disponível segundo a política interna do roteador, e a descida seleciona deterministicamente a folha associada ao terminal de destino.</w:t>
       </w:r>
     </w:p>
     <w:p>
@@ -384,7 +379,7 @@
           <w:sz w:val="20"/>
           <w:szCs w:val="20"/>
         </w:rPr>
-        <w:t xml:space="preserve">E. Controle de Fluxo por Créditos</w:t>
+        <w:t>E. Controle de Fluxo por Créditos</w:t>
       </w:r>
     </w:p>
     <w:p>
@@ -399,7 +394,7 @@
           <w:sz w:val="20"/>
           <w:szCs w:val="20"/>
         </w:rPr>
-        <w:t xml:space="preserve">O controle de fluxo por créditos previne overflow de buffers sem retransmissão. Cada canal mantém um contador que reflete o espaço livre no buffer de entrada do vizinho. O emissor decrementa um crédito ao enviar; o receptor devolve o crédito ao consumir o dado. Assim, nunca se transmite para um canal sem espaço disponível [3].</w:t>
+        <w:t>O controle de fluxo por créditos previne overflow de buffers sem retransmissão. Cada canal mantém um contador que reflete o espaço livre no buffer de entrada do vizinho. O emissor só transmite quando há espaço disponível no receptor [3]. Neste trabalho, o controle de fluxo é abstraído por capacidade de buffers: pacotes são aceitos quando há espaço e, em caso de saturação da entrada, podem ser mantidos nos buffers centrais QUP ou QDN para nova tentativa em ciclos seguintes.</w:t>
       </w:r>
     </w:p>
     <w:p>
@@ -415,7 +410,7 @@
           <w:sz w:val="20"/>
           <w:szCs w:val="20"/>
         </w:rPr>
-        <w:t xml:space="preserve">III. MODELO IMPLEMENTADO</w:t>
+        <w:t>III. MODELO IMPLEMENTADO</w:t>
       </w:r>
     </w:p>
     <w:p>
@@ -433,7 +428,7 @@
           <w:sz w:val="20"/>
           <w:szCs w:val="20"/>
         </w:rPr>
-        <w:t xml:space="preserve">A. Estrutura Modular</w:t>
+        <w:t>A. Estrutura Modular</w:t>
       </w:r>
     </w:p>
     <w:p>
@@ -448,7 +443,7 @@
           <w:sz w:val="20"/>
           <w:szCs w:val="20"/>
         </w:rPr>
-        <w:t xml:space="preserve">O simulador é organizado em cinco módulos principais:</w:t>
+        <w:t>O simulador é organizado em cinco módulos principais:</w:t>
       </w:r>
     </w:p>
     <w:p>
@@ -468,15 +463,14 @@
           <w:sz w:val="20"/>
           <w:szCs w:val="20"/>
         </w:rPr>
-        <w:t xml:space="preserve">Packet:</w:t>
-      </w:r>
-      <w:r>
-        <w:rPr>
-          <w:rFonts w:ascii="Times New Roman" w:cs="Times New Roman" w:eastAsia="Times New Roman" w:hAnsi="Times New Roman"/>
-          <w:sz w:val="20"/>
-          <w:szCs w:val="20"/>
-        </w:rPr>
-        <w:t xml:space="preserve"> struct que armazena id, terminais de origem/destino, roteadores correspondentes, ciclos de criação e entrega, tipo de porta de entrada e vetor route_history com o caminho percorrido.</w:t>
+        <w:t>Packet: struct que armazena id, terminal de origem, terminal de destino, roteadores correspondentes, ciclo de criação, ciclo de entrega e vetor route_history com o caminho percorrido.</w:t>
+      </w:r>
+      <w:r>
+        <w:rPr>
+          <w:rFonts w:ascii="Times New Roman" w:cs="Times New Roman" w:eastAsia="Times New Roman" w:hAnsi="Times New Roman"/>
+          <w:sz w:val="20"/>
+          <w:szCs w:val="20"/>
+        </w:rPr>
       </w:r>
     </w:p>
     <w:p>
@@ -496,15 +490,14 @@
           <w:sz w:val="20"/>
           <w:szCs w:val="20"/>
         </w:rPr>
-        <w:t xml:space="preserve">SpinRouter:</w:t>
-      </w:r>
-      <w:r>
-        <w:rPr>
-          <w:rFonts w:ascii="Times New Roman" w:cs="Times New Roman" w:eastAsia="Times New Roman" w:hAnsi="Times New Roman"/>
-          <w:sz w:val="20"/>
-          <w:szCs w:val="20"/>
-        </w:rPr>
-        <w:t xml:space="preserve"> roteador RSPIN com 4 portas DN (D0–D3) e 4 UP (U0–U3), buffers de entrada por porta (4 palavras cada, conforme especificação SPIN), buffers centrais QUP e QDN (18 palavras cada), contadores de crédito por canal (inicializados em 4) e arbitragem Round-Robin.</w:t>
+        <w:t>SpinRouter: modelo simplificado do roteador RSPIN com portas DN (D0-D3) e UP (U0-U3) representadas por buffers de pacotes. Cada entrada possui capacidade para 4 pacotes, e os buffers centrais QUP e QDN possuem capacidade para 18 pacotes, usados como overflow quando a entrada principal está cheia.</w:t>
+      </w:r>
+      <w:r>
+        <w:rPr>
+          <w:rFonts w:ascii="Times New Roman" w:cs="Times New Roman" w:eastAsia="Times New Roman" w:hAnsi="Times New Roman"/>
+          <w:sz w:val="20"/>
+          <w:szCs w:val="20"/>
+        </w:rPr>
       </w:r>
     </w:p>
     <w:p>
@@ -524,15 +517,14 @@
           <w:sz w:val="20"/>
           <w:szCs w:val="20"/>
         </w:rPr>
-        <w:t xml:space="preserve">SpinNetwork:</w:t>
-      </w:r>
-      <w:r>
-        <w:rPr>
-          <w:rFonts w:ascii="Times New Roman" w:cs="Times New Roman" w:eastAsia="Times New Roman" w:hAnsi="Times New Roman"/>
-          <w:sz w:val="20"/>
-          <w:szCs w:val="20"/>
-        </w:rPr>
-        <w:t xml:space="preserve"> constrói a topologia via buildTopology(), conecta os roteadores, coordena a injeção de pacotes e executa os ciclos de simulação em step().</w:t>
+        <w:t>SpinNetwork: carrega a topologia, conecta os roteadores, coordena a injeção de pacotes e executa os ciclos de simulação em step(). Também reúne estatísticas de pacotes entregues, descartados e pendentes.</w:t>
+      </w:r>
+      <w:r>
+        <w:rPr>
+          <w:rFonts w:ascii="Times New Roman" w:cs="Times New Roman" w:eastAsia="Times New Roman" w:hAnsi="Times New Roman"/>
+          <w:sz w:val="20"/>
+          <w:szCs w:val="20"/>
+        </w:rPr>
       </w:r>
     </w:p>
     <w:p>
@@ -552,15 +544,14 @@
           <w:sz w:val="20"/>
           <w:szCs w:val="20"/>
         </w:rPr>
-        <w:t xml:space="preserve">ConfigLoader:</w:t>
-      </w:r>
-      <w:r>
-        <w:rPr>
-          <w:rFonts w:ascii="Times New Roman" w:cs="Times New Roman" w:eastAsia="Times New Roman" w:hAnsi="Times New Roman"/>
-          <w:sz w:val="20"/>
-          <w:szCs w:val="20"/>
-        </w:rPr>
-        <w:t xml:space="preserve"> lê o arquivo de tráfego (formato texto, seção [traffic], com campos: ciclo, terminal_origem, terminal_destino) e gera a lista de TrafficEvent.</w:t>
+        <w:t>ConfigLoader: conjunto de funções que lê os arquivos de topologia e tráfego. O arquivo de topologia define roteadores folha, roteadores de topo e terminais; o arquivo de tráfego usa a seção [traffic], com campos: ciclo, terminal_origem e terminal_destino.</w:t>
+      </w:r>
+      <w:r>
+        <w:rPr>
+          <w:rFonts w:ascii="Times New Roman" w:cs="Times New Roman" w:eastAsia="Times New Roman" w:hAnsi="Times New Roman"/>
+          <w:sz w:val="20"/>
+          <w:szCs w:val="20"/>
+        </w:rPr>
       </w:r>
     </w:p>
     <w:p>
@@ -580,7 +571,7 @@
           <w:sz w:val="20"/>
           <w:szCs w:val="20"/>
         </w:rPr>
-        <w:t xml:space="preserve">SpinSimulation:</w:t>
+        <w:t>SpinSimulation:</w:t>
       </w:r>
       <w:r>
         <w:rPr>
@@ -603,7 +594,6 @@
           <w:sz w:val="20"/>
           <w:szCs w:val="20"/>
         </w:rPr>
-        <w:t xml:space="preserve"/>
       </w:r>
     </w:p>
     <w:p>
@@ -621,7 +611,7 @@
           <w:sz w:val="20"/>
           <w:szCs w:val="20"/>
         </w:rPr>
-        <w:t xml:space="preserve">B. Topologia Implementada</w:t>
+        <w:t>B. Topologia Implementada</w:t>
       </w:r>
     </w:p>
     <w:p>
@@ -636,7 +626,7 @@
           <w:sz w:val="20"/>
           <w:szCs w:val="20"/>
         </w:rPr>
-        <w:t xml:space="preserve">A topologia de 8 roteadores e 16 terminais é construída programaticamente. A Fig. 1 ilustra a hierarquia:</w:t>
+        <w:t>A topologia de 8 roteadores e 16 terminais é carregada a partir do arquivo input/topology_8.txt. A Fig. 1 ilustra a hierarquia:</w:t>
       </w:r>
     </w:p>
     <w:p>
@@ -651,7 +641,6 @@
           <w:sz w:val="20"/>
           <w:szCs w:val="20"/>
         </w:rPr>
-        <w:t xml:space="preserve"/>
       </w:r>
     </w:p>
     <w:tbl>
@@ -697,7 +686,7 @@
                 <w:sz w:val="15"/>
                 <w:szCs w:val="15"/>
               </w:rPr>
-              <w:t xml:space="preserve">     [R4]    [R5]    [R6]    [R7]     (nível 0 – topo)</w:t>
+              <w:t xml:space="preserve">     [R4]    [R5]    [R6]    [R7]     (nível 0 . topo)</w:t>
             </w:r>
           </w:p>
         </w:tc>
@@ -761,7 +750,7 @@
                 <w:sz w:val="15"/>
                 <w:szCs w:val="15"/>
               </w:rPr>
-              <w:t xml:space="preserve">  [R0]  [R1]  [R2]  [R3]            (nível 1 – folha)</w:t>
+              <w:t xml:space="preserve">  [R0]  [R1]  [R2]  [R3]            (nível 1 . folha)</w:t>
             </w:r>
           </w:p>
         </w:tc>
@@ -844,7 +833,7 @@
           <w:sz w:val="18"/>
           <w:szCs w:val="18"/>
         </w:rPr>
-        <w:t xml:space="preserve">Fig. 1 — Topologia: árvore gorda quaternária de 2 níveis</w:t>
+        <w:t>Fig. 1: Topologia em árvore gorda quaternária de 2 níveis</w:t>
       </w:r>
     </w:p>
     <w:p>
@@ -859,7 +848,6 @@
           <w:sz w:val="20"/>
           <w:szCs w:val="20"/>
         </w:rPr>
-        <w:t xml:space="preserve"/>
       </w:r>
     </w:p>
     <w:p>
@@ -874,7 +862,7 @@
           <w:sz w:val="20"/>
           <w:szCs w:val="20"/>
         </w:rPr>
-        <w:t xml:space="preserve">Cada roteador folha Ri (i=0..3) conecta suas portas U0–U3 respectivamente a R4–R7. Cada roteador de topo R(4+j) conecta sua porta Dj à folha Rj. Terminais são numerados T0–T15: folha Ri serve T(4i)–T(4i+3). Essa estrutura garante que qualquer par de terminais em folhas distintas é alcançável em exatamente 2 saltos de roteamento.</w:t>
+        <w:t>Cada roteador folha Ri (i=0..3) conecta suas portas U0-U3 respectivamente a R4-R7. Cada roteador de topo R(4+j) conecta sua porta Dj à folha Rj. Terminais são numerados T0-T15: a folha Ri serve T(4i) até T(4i+3). Essa estrutura garante que qualquer par de terminais em folhas distintas é alcançável em 2 saltos de roteamento entre roteadores, além das etapas de injeção e entrega nos terminais.</w:t>
       </w:r>
     </w:p>
     <w:p>
@@ -892,7 +880,7 @@
           <w:sz w:val="20"/>
           <w:szCs w:val="20"/>
         </w:rPr>
-        <w:t xml:space="preserve">C. Ciclo de Simulação</w:t>
+        <w:t>C. Ciclo de Simulação</w:t>
       </w:r>
     </w:p>
     <w:p>
@@ -907,7 +895,7 @@
           <w:sz w:val="20"/>
           <w:szCs w:val="20"/>
         </w:rPr>
-        <w:t xml:space="preserve">A cada ciclo, SpinNetwork::step() executa a sequência abaixo, garantindo que todos os roteadores processem o estado do ciclo N antes de qualquer um ver as alterações do ciclo N+1:</w:t>
+        <w:t>A cada ciclo, SpinNetwork::step() executa a sequência abaixo, mantendo separação entre o estado do ciclo atual e os pacotes visíveis no ciclo seguinte:</w:t>
       </w:r>
     </w:p>
     <w:p>
@@ -927,15 +915,14 @@
           <w:sz w:val="20"/>
           <w:szCs w:val="20"/>
         </w:rPr>
-        <w:t xml:space="preserve">1. process():</w:t>
-      </w:r>
-      <w:r>
-        <w:rPr>
-          <w:rFonts w:ascii="Times New Roman" w:cs="Times New Roman" w:eastAsia="Times New Roman" w:hAnsi="Times New Roman"/>
-          <w:sz w:val="20"/>
-          <w:szCs w:val="20"/>
-        </w:rPr>
-        <w:t xml:space="preserve"> cada roteador lê seus buffers current_ e emite requisições de encaminhamento (ForwardRequest), sem modificar o estado dos vizinhos.</w:t>
+        <w:t>1. Injeção: os eventos do ciclo atual são lidos do arquivo de tráfego e os pacotes são inseridos no roteador folha associado ao terminal de origem.</w:t>
+      </w:r>
+      <w:r>
+        <w:rPr>
+          <w:rFonts w:ascii="Times New Roman" w:cs="Times New Roman" w:eastAsia="Times New Roman" w:hAnsi="Times New Roman"/>
+          <w:sz w:val="20"/>
+          <w:szCs w:val="20"/>
+        </w:rPr>
       </w:r>
     </w:p>
     <w:p>
@@ -955,15 +942,14 @@
           <w:sz w:val="20"/>
           <w:szCs w:val="20"/>
         </w:rPr>
-        <w:t xml:space="preserve">2. Aplicação:</w:t>
-      </w:r>
-      <w:r>
-        <w:rPr>
-          <w:rFonts w:ascii="Times New Roman" w:cs="Times New Roman" w:eastAsia="Times New Roman" w:hAnsi="Times New Roman"/>
-          <w:sz w:val="20"/>
-          <w:szCs w:val="20"/>
-        </w:rPr>
-        <w:t xml:space="preserve"> as requisições são executadas — pacotes inseridos nos buffers next_ do vizinho destino ou marcados como entregues se o alvo é um terminal.</w:t>
+        <w:t>2. Processamento: cada roteador examina suas entradas e seus buffers centrais, tenta encaminhar pacotes e registra requisições de entrega ou movimentação.</w:t>
+      </w:r>
+      <w:r>
+        <w:rPr>
+          <w:rFonts w:ascii="Times New Roman" w:cs="Times New Roman" w:eastAsia="Times New Roman" w:hAnsi="Times New Roman"/>
+          <w:sz w:val="20"/>
+          <w:szCs w:val="20"/>
+        </w:rPr>
       </w:r>
     </w:p>
     <w:p>
@@ -983,15 +969,14 @@
           <w:sz w:val="20"/>
           <w:szCs w:val="20"/>
         </w:rPr>
-        <w:t xml:space="preserve">3. commitNextCycle():</w:t>
-      </w:r>
-      <w:r>
-        <w:rPr>
-          <w:rFonts w:ascii="Times New Roman" w:cs="Times New Roman" w:eastAsia="Times New Roman" w:hAnsi="Times New Roman"/>
-          <w:sz w:val="20"/>
-          <w:szCs w:val="20"/>
-        </w:rPr>
-        <w:t xml:space="preserve"> promove next_ para current_ em todos os roteadores simultaneamente.</w:t>
+        <w:t>3. Atualização: pacotes encaminhados são inseridos nos buffers do próximo ciclo dos roteadores vizinhos, ou marcados como entregues quando alcançam o terminal de destino.</w:t>
+      </w:r>
+      <w:r>
+        <w:rPr>
+          <w:rFonts w:ascii="Times New Roman" w:cs="Times New Roman" w:eastAsia="Times New Roman" w:hAnsi="Times New Roman"/>
+          <w:sz w:val="20"/>
+          <w:szCs w:val="20"/>
+        </w:rPr>
       </w:r>
     </w:p>
     <w:p>
@@ -1011,15 +996,14 @@
           <w:sz w:val="20"/>
           <w:szCs w:val="20"/>
         </w:rPr>
-        <w:t xml:space="preserve">4. Créditos:</w:t>
-      </w:r>
-      <w:r>
-        <w:rPr>
-          <w:rFonts w:ascii="Times New Roman" w:cs="Times New Roman" w:eastAsia="Times New Roman" w:hAnsi="Times New Roman"/>
-          <w:sz w:val="20"/>
-          <w:szCs w:val="20"/>
-        </w:rPr>
-        <w:t xml:space="preserve"> após o commit, créditos são devolvidos ao emissor — garantindo que o receptor de fato consumiu espaço antes de o emissor reutilizar o canal.</w:t>
+        <w:t>4. Finalização do ciclo: commitNextCycle() promove os buffers next_ para current_. Se todos os eventos foram processados e a rede está vazia, a simulação encerra antecipadamente.</w:t>
+      </w:r>
+      <w:r>
+        <w:rPr>
+          <w:rFonts w:ascii="Times New Roman" w:cs="Times New Roman" w:eastAsia="Times New Roman" w:hAnsi="Times New Roman"/>
+          <w:sz w:val="20"/>
+          <w:szCs w:val="20"/>
+        </w:rPr>
       </w:r>
     </w:p>
     <w:p>
@@ -1034,7 +1018,6 @@
           <w:sz w:val="20"/>
           <w:szCs w:val="20"/>
         </w:rPr>
-        <w:t xml:space="preserve"/>
       </w:r>
     </w:p>
     <w:p>
@@ -1050,7 +1033,7 @@
           <w:sz w:val="20"/>
           <w:szCs w:val="20"/>
         </w:rPr>
-        <w:t xml:space="preserve">IV. RESULTADOS</w:t>
+        <w:t>IV. RESULTADOS</w:t>
       </w:r>
     </w:p>
     <w:p>
@@ -1068,7 +1051,7 @@
           <w:sz w:val="20"/>
           <w:szCs w:val="20"/>
         </w:rPr>
-        <w:t xml:space="preserve">A. Cenário de Simulação</w:t>
+        <w:t>A. Cenário de Simulação</w:t>
       </w:r>
     </w:p>
     <w:p>
@@ -1083,7 +1066,7 @@
           <w:sz w:val="20"/>
           <w:szCs w:val="20"/>
         </w:rPr>
-        <w:t xml:space="preserve">O cenário de teste (traffic_1.txt) define 5 pacotes entre folhas distintas, injetados um por ciclo a partir do ciclo 0. A Tab. I apresenta as rotas e latências observadas no log de simulação.</w:t>
+        <w:t>O cenário de teste (traffic_1.txt) define 5 pacotes entre folhas distintas, injetados um por ciclo a partir do ciclo 0. A Tab. I apresenta as rotas e latências observadas no log de simulação.</w:t>
       </w:r>
     </w:p>
     <w:p>
@@ -1098,7 +1081,6 @@
           <w:sz w:val="20"/>
           <w:szCs w:val="20"/>
         </w:rPr>
-        <w:t xml:space="preserve"/>
       </w:r>
     </w:p>
     <w:p>
@@ -1114,7 +1096,7 @@
           <w:sz w:val="18"/>
           <w:szCs w:val="18"/>
         </w:rPr>
-        <w:t xml:space="preserve">Tab. I — Rotas e latências dos pacotes simulados</w:t>
+        <w:t>Tab. I: Rotas e latências dos pacotes simulados</w:t>
       </w:r>
     </w:p>
     <w:tbl>
@@ -1170,7 +1152,7 @@
                 <w:sz w:val="17"/>
                 <w:szCs w:val="17"/>
               </w:rPr>
-              <w:t xml:space="preserve">Pac.</w:t>
+              <w:t>Pac.</w:t>
             </w:r>
           </w:p>
         </w:tc>
@@ -1205,7 +1187,7 @@
                 <w:sz w:val="17"/>
                 <w:szCs w:val="17"/>
               </w:rPr>
-              <w:t xml:space="preserve">Origem</w:t>
+              <w:t>Origem</w:t>
             </w:r>
           </w:p>
         </w:tc>
@@ -1240,7 +1222,7 @@
                 <w:sz w:val="17"/>
                 <w:szCs w:val="17"/>
               </w:rPr>
-              <w:t xml:space="preserve">Destino</w:t>
+              <w:t>Destino</w:t>
             </w:r>
           </w:p>
         </w:tc>
@@ -1275,7 +1257,7 @@
                 <w:sz w:val="17"/>
                 <w:szCs w:val="17"/>
               </w:rPr>
-              <w:t xml:space="preserve">Criado</w:t>
+              <w:t>Criado</w:t>
             </w:r>
           </w:p>
         </w:tc>
@@ -1310,7 +1292,7 @@
                 <w:sz w:val="17"/>
                 <w:szCs w:val="17"/>
               </w:rPr>
-              <w:t xml:space="preserve">Rota</w:t>
+              <w:t>Rota</w:t>
             </w:r>
           </w:p>
         </w:tc>
@@ -1345,7 +1327,7 @@
                 <w:sz w:val="17"/>
                 <w:szCs w:val="17"/>
               </w:rPr>
-              <w:t xml:space="preserve">Latência</w:t>
+              <w:t>Latência</w:t>
             </w:r>
           </w:p>
         </w:tc>
@@ -1382,7 +1364,7 @@
                 <w:sz w:val="17"/>
                 <w:szCs w:val="17"/>
               </w:rPr>
-              <w:t xml:space="preserve">P0</w:t>
+              <w:t>P0</w:t>
             </w:r>
           </w:p>
         </w:tc>
@@ -1417,7 +1399,7 @@
                 <w:sz w:val="17"/>
                 <w:szCs w:val="17"/>
               </w:rPr>
-              <w:t xml:space="preserve">T0 → R0</w:t>
+              <w:t>T0 → R0</w:t>
             </w:r>
           </w:p>
         </w:tc>
@@ -1452,7 +1434,7 @@
                 <w:sz w:val="17"/>
                 <w:szCs w:val="17"/>
               </w:rPr>
-              <w:t xml:space="preserve">T15 → R3</w:t>
+              <w:t>T15 → R3</w:t>
             </w:r>
           </w:p>
         </w:tc>
@@ -1487,7 +1469,7 @@
                 <w:sz w:val="17"/>
                 <w:szCs w:val="17"/>
               </w:rPr>
-              <w:t xml:space="preserve">C0</w:t>
+              <w:t>C0</w:t>
             </w:r>
           </w:p>
         </w:tc>
@@ -1522,7 +1504,7 @@
                 <w:sz w:val="17"/>
                 <w:szCs w:val="17"/>
               </w:rPr>
-              <w:t xml:space="preserve">R0 → R4 → R3</w:t>
+              <w:t>R0 → R4 → R3</w:t>
             </w:r>
           </w:p>
         </w:tc>
@@ -1557,7 +1539,7 @@
                 <w:sz w:val="17"/>
                 <w:szCs w:val="17"/>
               </w:rPr>
-              <w:t xml:space="preserve">3 ciclos</w:t>
+              <w:t>3 ciclos</w:t>
             </w:r>
           </w:p>
         </w:tc>
@@ -1594,7 +1576,7 @@
                 <w:sz w:val="17"/>
                 <w:szCs w:val="17"/>
               </w:rPr>
-              <w:t xml:space="preserve">P1</w:t>
+              <w:t>P1</w:t>
             </w:r>
           </w:p>
         </w:tc>
@@ -1629,7 +1611,7 @@
                 <w:sz w:val="17"/>
                 <w:szCs w:val="17"/>
               </w:rPr>
-              <w:t xml:space="preserve">T5 → R1</w:t>
+              <w:t>T5 → R1</w:t>
             </w:r>
           </w:p>
         </w:tc>
@@ -1664,7 +1646,7 @@
                 <w:sz w:val="17"/>
                 <w:szCs w:val="17"/>
               </w:rPr>
-              <w:t xml:space="preserve">T10 → R2</w:t>
+              <w:t>T10 → R2</w:t>
             </w:r>
           </w:p>
         </w:tc>
@@ -1699,7 +1681,7 @@
                 <w:sz w:val="17"/>
                 <w:szCs w:val="17"/>
               </w:rPr>
-              <w:t xml:space="preserve">C1</w:t>
+              <w:t>C1</w:t>
             </w:r>
           </w:p>
         </w:tc>
@@ -1734,7 +1716,7 @@
                 <w:sz w:val="17"/>
                 <w:szCs w:val="17"/>
               </w:rPr>
-              <w:t xml:space="preserve">R1 → R4 → R2</w:t>
+              <w:t>R1 → R4 → R2</w:t>
             </w:r>
           </w:p>
         </w:tc>
@@ -1769,7 +1751,7 @@
                 <w:sz w:val="17"/>
                 <w:szCs w:val="17"/>
               </w:rPr>
-              <w:t xml:space="preserve">3 ciclos</w:t>
+              <w:t>3 ciclos</w:t>
             </w:r>
           </w:p>
         </w:tc>
@@ -1806,7 +1788,7 @@
                 <w:sz w:val="17"/>
                 <w:szCs w:val="17"/>
               </w:rPr>
-              <w:t xml:space="preserve">P2</w:t>
+              <w:t>P2</w:t>
             </w:r>
           </w:p>
         </w:tc>
@@ -1841,7 +1823,7 @@
                 <w:sz w:val="17"/>
                 <w:szCs w:val="17"/>
               </w:rPr>
-              <w:t xml:space="preserve">T14 → R3</w:t>
+              <w:t>T14 → R3</w:t>
             </w:r>
           </w:p>
         </w:tc>
@@ -1876,7 +1858,7 @@
                 <w:sz w:val="17"/>
                 <w:szCs w:val="17"/>
               </w:rPr>
-              <w:t xml:space="preserve">T1 → R0</w:t>
+              <w:t>T1 → R0</w:t>
             </w:r>
           </w:p>
         </w:tc>
@@ -1911,7 +1893,7 @@
                 <w:sz w:val="17"/>
                 <w:szCs w:val="17"/>
               </w:rPr>
-              <w:t xml:space="preserve">C2</w:t>
+              <w:t>C2</w:t>
             </w:r>
           </w:p>
         </w:tc>
@@ -1946,7 +1928,7 @@
                 <w:sz w:val="17"/>
                 <w:szCs w:val="17"/>
               </w:rPr>
-              <w:t xml:space="preserve">R3 → R4 → R0</w:t>
+              <w:t>R3 → R4 → R0</w:t>
             </w:r>
           </w:p>
         </w:tc>
@@ -1981,7 +1963,7 @@
                 <w:sz w:val="17"/>
                 <w:szCs w:val="17"/>
               </w:rPr>
-              <w:t xml:space="preserve">3 ciclos</w:t>
+              <w:t>3 ciclos</w:t>
             </w:r>
           </w:p>
         </w:tc>
@@ -2018,7 +2000,7 @@
                 <w:sz w:val="17"/>
                 <w:szCs w:val="17"/>
               </w:rPr>
-              <w:t xml:space="preserve">P3</w:t>
+              <w:t>P3</w:t>
             </w:r>
           </w:p>
         </w:tc>
@@ -2053,7 +2035,7 @@
                 <w:sz w:val="17"/>
                 <w:szCs w:val="17"/>
               </w:rPr>
-              <w:t xml:space="preserve">T3 → R0</w:t>
+              <w:t>T3 → R0</w:t>
             </w:r>
           </w:p>
         </w:tc>
@@ -2088,7 +2070,7 @@
                 <w:sz w:val="17"/>
                 <w:szCs w:val="17"/>
               </w:rPr>
-              <w:t xml:space="preserve">T12 → R3</w:t>
+              <w:t>T12 → R3</w:t>
             </w:r>
           </w:p>
         </w:tc>
@@ -2123,7 +2105,7 @@
                 <w:sz w:val="17"/>
                 <w:szCs w:val="17"/>
               </w:rPr>
-              <w:t xml:space="preserve">C3</w:t>
+              <w:t>C3</w:t>
             </w:r>
           </w:p>
         </w:tc>
@@ -2158,7 +2140,7 @@
                 <w:sz w:val="17"/>
                 <w:szCs w:val="17"/>
               </w:rPr>
-              <w:t xml:space="preserve">R0 → R5 → R3</w:t>
+              <w:t>R0 → R5 → R3</w:t>
             </w:r>
           </w:p>
         </w:tc>
@@ -2193,7 +2175,7 @@
                 <w:sz w:val="17"/>
                 <w:szCs w:val="17"/>
               </w:rPr>
-              <w:t xml:space="preserve">3 ciclos</w:t>
+              <w:t>3 ciclos</w:t>
             </w:r>
           </w:p>
         </w:tc>
@@ -2230,7 +2212,7 @@
                 <w:sz w:val="17"/>
                 <w:szCs w:val="17"/>
               </w:rPr>
-              <w:t xml:space="preserve">P4</w:t>
+              <w:t>P4</w:t>
             </w:r>
           </w:p>
         </w:tc>
@@ -2265,7 +2247,7 @@
                 <w:sz w:val="17"/>
                 <w:szCs w:val="17"/>
               </w:rPr>
-              <w:t xml:space="preserve">T8 → R2</w:t>
+              <w:t>T8 → R2</w:t>
             </w:r>
           </w:p>
         </w:tc>
@@ -2300,7 +2282,7 @@
                 <w:sz w:val="17"/>
                 <w:szCs w:val="17"/>
               </w:rPr>
-              <w:t xml:space="preserve">T7 → R1</w:t>
+              <w:t>T7 → R1</w:t>
             </w:r>
           </w:p>
         </w:tc>
@@ -2335,7 +2317,7 @@
                 <w:sz w:val="17"/>
                 <w:szCs w:val="17"/>
               </w:rPr>
-              <w:t xml:space="preserve">C4</w:t>
+              <w:t>C4</w:t>
             </w:r>
           </w:p>
         </w:tc>
@@ -2370,7 +2352,7 @@
                 <w:sz w:val="17"/>
                 <w:szCs w:val="17"/>
               </w:rPr>
-              <w:t xml:space="preserve">R2 → R4 → R1</w:t>
+              <w:t>R2 → R4 → R1</w:t>
             </w:r>
           </w:p>
         </w:tc>
@@ -2405,7 +2387,7 @@
                 <w:sz w:val="17"/>
                 <w:szCs w:val="17"/>
               </w:rPr>
-              <w:t xml:space="preserve">3 ciclos</w:t>
+              <w:t>3 ciclos</w:t>
             </w:r>
           </w:p>
         </w:tc>
@@ -2423,7 +2405,6 @@
           <w:sz w:val="20"/>
           <w:szCs w:val="20"/>
         </w:rPr>
-        <w:t xml:space="preserve"/>
       </w:r>
     </w:p>
     <w:p>
@@ -2441,7 +2422,7 @@
           <w:sz w:val="20"/>
           <w:szCs w:val="20"/>
         </w:rPr>
-        <w:t xml:space="preserve">B. Diagrama de Forma de Onda</w:t>
+        <w:t>B. Diagrama Temporal da Simulação</w:t>
       </w:r>
     </w:p>
     <w:p>
@@ -2456,7 +2437,7 @@
           <w:sz w:val="20"/>
           <w:szCs w:val="20"/>
         </w:rPr>
-        <w:t xml:space="preserve">A Tab. II mostra o estado de cada pacote em cada ciclo de simulação, extraído diretamente do log. As cores indicam: azul = injeção, amarelo = subida (folha→topo), laranja = descida (topo→folha), verde = entrega.</w:t>
+        <w:t>A Tab. II mostra o estado de cada pacote em cada ciclo de simulação, extraído diretamente do log. A tabela registra a injeção, a subida até o roteador de topo, a descida para a folha de destino e a entrega ao terminal final.</w:t>
       </w:r>
     </w:p>
     <w:p>
@@ -2471,7 +2452,6 @@
           <w:sz w:val="20"/>
           <w:szCs w:val="20"/>
         </w:rPr>
-        <w:t xml:space="preserve"/>
       </w:r>
     </w:p>
     <w:p>
@@ -2487,7 +2467,7 @@
           <w:sz w:val="18"/>
           <w:szCs w:val="18"/>
         </w:rPr>
-        <w:t xml:space="preserve">Tab. II — Diagrama de forma de onda (estado por ciclo)</w:t>
+        <w:t>Tab. II: Diagrama temporal da simulação</w:t>
       </w:r>
     </w:p>
     <w:tbl>
@@ -2546,7 +2526,6 @@
                 <w:sz w:val="17"/>
                 <w:szCs w:val="17"/>
               </w:rPr>
-              <w:t xml:space="preserve"/>
             </w:r>
           </w:p>
         </w:tc>
@@ -2581,7 +2560,7 @@
                 <w:sz w:val="17"/>
                 <w:szCs w:val="17"/>
               </w:rPr>
-              <w:t xml:space="preserve">C0</w:t>
+              <w:t>C0</w:t>
             </w:r>
           </w:p>
         </w:tc>
@@ -2616,7 +2595,7 @@
                 <w:sz w:val="17"/>
                 <w:szCs w:val="17"/>
               </w:rPr>
-              <w:t xml:space="preserve">C1</w:t>
+              <w:t>C1</w:t>
             </w:r>
           </w:p>
         </w:tc>
@@ -2651,7 +2630,7 @@
                 <w:sz w:val="17"/>
                 <w:szCs w:val="17"/>
               </w:rPr>
-              <w:t xml:space="preserve">C2</w:t>
+              <w:t>C2</w:t>
             </w:r>
           </w:p>
         </w:tc>
@@ -2686,7 +2665,7 @@
                 <w:sz w:val="17"/>
                 <w:szCs w:val="17"/>
               </w:rPr>
-              <w:t xml:space="preserve">C3</w:t>
+              <w:t>C3</w:t>
             </w:r>
           </w:p>
         </w:tc>
@@ -2721,7 +2700,7 @@
                 <w:sz w:val="17"/>
                 <w:szCs w:val="17"/>
               </w:rPr>
-              <w:t xml:space="preserve">C4</w:t>
+              <w:t>C4</w:t>
             </w:r>
           </w:p>
         </w:tc>
@@ -2756,7 +2735,7 @@
                 <w:sz w:val="17"/>
                 <w:szCs w:val="17"/>
               </w:rPr>
-              <w:t xml:space="preserve">C5</w:t>
+              <w:t>C5</w:t>
             </w:r>
           </w:p>
         </w:tc>
@@ -2791,7 +2770,7 @@
                 <w:sz w:val="17"/>
                 <w:szCs w:val="17"/>
               </w:rPr>
-              <w:t xml:space="preserve">C6</w:t>
+              <w:t>C6</w:t>
             </w:r>
           </w:p>
         </w:tc>
@@ -2826,7 +2805,7 @@
                 <w:sz w:val="17"/>
                 <w:szCs w:val="17"/>
               </w:rPr>
-              <w:t xml:space="preserve">C7</w:t>
+              <w:t>C7</w:t>
             </w:r>
           </w:p>
         </w:tc>
@@ -2863,7 +2842,7 @@
                 <w:sz w:val="17"/>
                 <w:szCs w:val="17"/>
               </w:rPr>
-              <w:t xml:space="preserve">P0</w:t>
+              <w:t>P0</w:t>
             </w:r>
           </w:p>
         </w:tc>
@@ -2894,7 +2873,7 @@
                 <w:sz w:val="16"/>
                 <w:szCs w:val="16"/>
               </w:rPr>
-              <w:t xml:space="preserve">Inj</w:t>
+              <w:t>Inj</w:t>
             </w:r>
           </w:p>
         </w:tc>
@@ -2925,7 +2904,7 @@
                 <w:sz w:val="16"/>
                 <w:szCs w:val="16"/>
               </w:rPr>
-              <w:t xml:space="preserve">↑R4</w:t>
+              <w:t>↑R4</w:t>
             </w:r>
           </w:p>
         </w:tc>
@@ -2956,7 +2935,7 @@
                 <w:sz w:val="16"/>
                 <w:szCs w:val="16"/>
               </w:rPr>
-              <w:t xml:space="preserve">↓R3</w:t>
+              <w:t>↓R3</w:t>
             </w:r>
           </w:p>
         </w:tc>
@@ -2987,7 +2966,7 @@
                 <w:sz w:val="16"/>
                 <w:szCs w:val="16"/>
               </w:rPr>
-              <w:t xml:space="preserve">✓T15</w:t>
+              <w:t>✓T15</w:t>
             </w:r>
           </w:p>
         </w:tc>
@@ -3018,7 +2997,7 @@
                 <w:sz w:val="16"/>
                 <w:szCs w:val="16"/>
               </w:rPr>
-              <w:t xml:space="preserve">–</w:t>
+              <w:t>.</w:t>
             </w:r>
           </w:p>
         </w:tc>
@@ -3049,7 +3028,7 @@
                 <w:sz w:val="16"/>
                 <w:szCs w:val="16"/>
               </w:rPr>
-              <w:t xml:space="preserve">–</w:t>
+              <w:t>.</w:t>
             </w:r>
           </w:p>
         </w:tc>
@@ -3080,7 +3059,7 @@
                 <w:sz w:val="16"/>
                 <w:szCs w:val="16"/>
               </w:rPr>
-              <w:t xml:space="preserve">–</w:t>
+              <w:t>.</w:t>
             </w:r>
           </w:p>
         </w:tc>
@@ -3111,7 +3090,7 @@
                 <w:sz w:val="16"/>
                 <w:szCs w:val="16"/>
               </w:rPr>
-              <w:t xml:space="preserve">–</w:t>
+              <w:t>.</w:t>
             </w:r>
           </w:p>
         </w:tc>
@@ -3148,7 +3127,7 @@
                 <w:sz w:val="17"/>
                 <w:szCs w:val="17"/>
               </w:rPr>
-              <w:t xml:space="preserve">P1</w:t>
+              <w:t>P1</w:t>
             </w:r>
           </w:p>
         </w:tc>
@@ -3179,7 +3158,7 @@
                 <w:sz w:val="16"/>
                 <w:szCs w:val="16"/>
               </w:rPr>
-              <w:t xml:space="preserve">–</w:t>
+              <w:t>.</w:t>
             </w:r>
           </w:p>
         </w:tc>
@@ -3210,7 +3189,7 @@
                 <w:sz w:val="16"/>
                 <w:szCs w:val="16"/>
               </w:rPr>
-              <w:t xml:space="preserve">Inj</w:t>
+              <w:t>Inj</w:t>
             </w:r>
           </w:p>
         </w:tc>
@@ -3241,7 +3220,7 @@
                 <w:sz w:val="16"/>
                 <w:szCs w:val="16"/>
               </w:rPr>
-              <w:t xml:space="preserve">↑R4</w:t>
+              <w:t>↑R4</w:t>
             </w:r>
           </w:p>
         </w:tc>
@@ -3272,7 +3251,7 @@
                 <w:sz w:val="16"/>
                 <w:szCs w:val="16"/>
               </w:rPr>
-              <w:t xml:space="preserve">↓R2</w:t>
+              <w:t>↓R2</w:t>
             </w:r>
           </w:p>
         </w:tc>
@@ -3303,7 +3282,7 @@
                 <w:sz w:val="16"/>
                 <w:szCs w:val="16"/>
               </w:rPr>
-              <w:t xml:space="preserve">✓T10</w:t>
+              <w:t>✓T10</w:t>
             </w:r>
           </w:p>
         </w:tc>
@@ -3334,7 +3313,7 @@
                 <w:sz w:val="16"/>
                 <w:szCs w:val="16"/>
               </w:rPr>
-              <w:t xml:space="preserve">–</w:t>
+              <w:t>.</w:t>
             </w:r>
           </w:p>
         </w:tc>
@@ -3365,7 +3344,7 @@
                 <w:sz w:val="16"/>
                 <w:szCs w:val="16"/>
               </w:rPr>
-              <w:t xml:space="preserve">–</w:t>
+              <w:t>.</w:t>
             </w:r>
           </w:p>
         </w:tc>
@@ -3396,7 +3375,7 @@
                 <w:sz w:val="16"/>
                 <w:szCs w:val="16"/>
               </w:rPr>
-              <w:t xml:space="preserve">–</w:t>
+              <w:t>.</w:t>
             </w:r>
           </w:p>
         </w:tc>
@@ -3433,7 +3412,7 @@
                 <w:sz w:val="17"/>
                 <w:szCs w:val="17"/>
               </w:rPr>
-              <w:t xml:space="preserve">P2</w:t>
+              <w:t>P2</w:t>
             </w:r>
           </w:p>
         </w:tc>
@@ -3464,7 +3443,7 @@
                 <w:sz w:val="16"/>
                 <w:szCs w:val="16"/>
               </w:rPr>
-              <w:t xml:space="preserve">–</w:t>
+              <w:t>.</w:t>
             </w:r>
           </w:p>
         </w:tc>
@@ -3495,7 +3474,7 @@
                 <w:sz w:val="16"/>
                 <w:szCs w:val="16"/>
               </w:rPr>
-              <w:t xml:space="preserve">–</w:t>
+              <w:t>.</w:t>
             </w:r>
           </w:p>
         </w:tc>
@@ -3526,7 +3505,7 @@
                 <w:sz w:val="16"/>
                 <w:szCs w:val="16"/>
               </w:rPr>
-              <w:t xml:space="preserve">Inj</w:t>
+              <w:t>Inj</w:t>
             </w:r>
           </w:p>
         </w:tc>
@@ -3557,7 +3536,7 @@
                 <w:sz w:val="16"/>
                 <w:szCs w:val="16"/>
               </w:rPr>
-              <w:t xml:space="preserve">↑R4</w:t>
+              <w:t>↑R4</w:t>
             </w:r>
           </w:p>
         </w:tc>
@@ -3588,7 +3567,7 @@
                 <w:sz w:val="16"/>
                 <w:szCs w:val="16"/>
               </w:rPr>
-              <w:t xml:space="preserve">↓R0</w:t>
+              <w:t>↓R0</w:t>
             </w:r>
           </w:p>
         </w:tc>
@@ -3619,7 +3598,7 @@
                 <w:sz w:val="16"/>
                 <w:szCs w:val="16"/>
               </w:rPr>
-              <w:t xml:space="preserve">✓T1</w:t>
+              <w:t>✓T1</w:t>
             </w:r>
           </w:p>
         </w:tc>
@@ -3650,7 +3629,7 @@
                 <w:sz w:val="16"/>
                 <w:szCs w:val="16"/>
               </w:rPr>
-              <w:t xml:space="preserve">–</w:t>
+              <w:t>.</w:t>
             </w:r>
           </w:p>
         </w:tc>
@@ -3681,7 +3660,7 @@
                 <w:sz w:val="16"/>
                 <w:szCs w:val="16"/>
               </w:rPr>
-              <w:t xml:space="preserve">–</w:t>
+              <w:t>.</w:t>
             </w:r>
           </w:p>
         </w:tc>
@@ -3718,7 +3697,7 @@
                 <w:sz w:val="17"/>
                 <w:szCs w:val="17"/>
               </w:rPr>
-              <w:t xml:space="preserve">P3</w:t>
+              <w:t>P3</w:t>
             </w:r>
           </w:p>
         </w:tc>
@@ -3749,7 +3728,7 @@
                 <w:sz w:val="16"/>
                 <w:szCs w:val="16"/>
               </w:rPr>
-              <w:t xml:space="preserve">–</w:t>
+              <w:t>.</w:t>
             </w:r>
           </w:p>
         </w:tc>
@@ -3780,7 +3759,7 @@
                 <w:sz w:val="16"/>
                 <w:szCs w:val="16"/>
               </w:rPr>
-              <w:t xml:space="preserve">–</w:t>
+              <w:t>.</w:t>
             </w:r>
           </w:p>
         </w:tc>
@@ -3811,7 +3790,7 @@
                 <w:sz w:val="16"/>
                 <w:szCs w:val="16"/>
               </w:rPr>
-              <w:t xml:space="preserve">–</w:t>
+              <w:t>.</w:t>
             </w:r>
           </w:p>
         </w:tc>
@@ -3842,7 +3821,7 @@
                 <w:sz w:val="16"/>
                 <w:szCs w:val="16"/>
               </w:rPr>
-              <w:t xml:space="preserve">Inj</w:t>
+              <w:t>Inj</w:t>
             </w:r>
           </w:p>
         </w:tc>
@@ -3873,7 +3852,7 @@
                 <w:sz w:val="16"/>
                 <w:szCs w:val="16"/>
               </w:rPr>
-              <w:t xml:space="preserve">↑R5</w:t>
+              <w:t>↑R5</w:t>
             </w:r>
           </w:p>
         </w:tc>
@@ -3904,7 +3883,7 @@
                 <w:sz w:val="16"/>
                 <w:szCs w:val="16"/>
               </w:rPr>
-              <w:t xml:space="preserve">↓R3</w:t>
+              <w:t>↓R3</w:t>
             </w:r>
           </w:p>
         </w:tc>
@@ -3935,7 +3914,7 @@
                 <w:sz w:val="16"/>
                 <w:szCs w:val="16"/>
               </w:rPr>
-              <w:t xml:space="preserve">✓T12</w:t>
+              <w:t>✓T12</w:t>
             </w:r>
           </w:p>
         </w:tc>
@@ -3966,7 +3945,7 @@
                 <w:sz w:val="16"/>
                 <w:szCs w:val="16"/>
               </w:rPr>
-              <w:t xml:space="preserve">–</w:t>
+              <w:t>.</w:t>
             </w:r>
           </w:p>
         </w:tc>
@@ -4003,7 +3982,7 @@
                 <w:sz w:val="17"/>
                 <w:szCs w:val="17"/>
               </w:rPr>
-              <w:t xml:space="preserve">P4</w:t>
+              <w:t>P4</w:t>
             </w:r>
           </w:p>
         </w:tc>
@@ -4034,7 +4013,7 @@
                 <w:sz w:val="16"/>
                 <w:szCs w:val="16"/>
               </w:rPr>
-              <w:t xml:space="preserve">–</w:t>
+              <w:t>.</w:t>
             </w:r>
           </w:p>
         </w:tc>
@@ -4065,7 +4044,7 @@
                 <w:sz w:val="16"/>
                 <w:szCs w:val="16"/>
               </w:rPr>
-              <w:t xml:space="preserve">–</w:t>
+              <w:t>.</w:t>
             </w:r>
           </w:p>
         </w:tc>
@@ -4096,7 +4075,7 @@
                 <w:sz w:val="16"/>
                 <w:szCs w:val="16"/>
               </w:rPr>
-              <w:t xml:space="preserve">–</w:t>
+              <w:t>.</w:t>
             </w:r>
           </w:p>
         </w:tc>
@@ -4127,7 +4106,7 @@
                 <w:sz w:val="16"/>
                 <w:szCs w:val="16"/>
               </w:rPr>
-              <w:t xml:space="preserve">–</w:t>
+              <w:t>.</w:t>
             </w:r>
           </w:p>
         </w:tc>
@@ -4158,7 +4137,7 @@
                 <w:sz w:val="16"/>
                 <w:szCs w:val="16"/>
               </w:rPr>
-              <w:t xml:space="preserve">Inj</w:t>
+              <w:t>Inj</w:t>
             </w:r>
           </w:p>
         </w:tc>
@@ -4189,7 +4168,7 @@
                 <w:sz w:val="16"/>
                 <w:szCs w:val="16"/>
               </w:rPr>
-              <w:t xml:space="preserve">↑R4</w:t>
+              <w:t>↑R4</w:t>
             </w:r>
           </w:p>
         </w:tc>
@@ -4220,7 +4199,7 @@
                 <w:sz w:val="16"/>
                 <w:szCs w:val="16"/>
               </w:rPr>
-              <w:t xml:space="preserve">↓R1</w:t>
+              <w:t>↓R1</w:t>
             </w:r>
           </w:p>
         </w:tc>
@@ -4251,7 +4230,7 @@
                 <w:sz w:val="16"/>
                 <w:szCs w:val="16"/>
               </w:rPr>
-              <w:t xml:space="preserve">✓T7</w:t>
+              <w:t>✓T7</w:t>
             </w:r>
           </w:p>
         </w:tc>
@@ -4269,7 +4248,6 @@
           <w:sz w:val="20"/>
           <w:szCs w:val="20"/>
         </w:rPr>
-        <w:t xml:space="preserve"/>
       </w:r>
     </w:p>
     <w:p>
@@ -4284,7 +4262,7 @@
           <w:sz w:val="20"/>
           <w:szCs w:val="20"/>
         </w:rPr>
-        <w:t xml:space="preserve">O diagrama confirma o pipeline de 3 estágios: injeção em C, subida em C+1, descida em C+2, entrega em C+3. P3 utiliza R5 em vez de R4 (roteamento adaptativo: R4 estava com crédito reduzido pelos pacotes P0–P2).</w:t>
+        <w:t>O diagrama confirma o comportamento em 3 ciclos para o cenário principal: injeção em C, subida em C+1, descida em C+2 e entrega em C+3. P3 utiliza R5 em vez de R4 devido à política simplificada de seleção de saída superior do simulador. Esse comportamento distribui parte do tráfego entre roteadores de topo, mas não representa uma arbitragem SPIN completa.</w:t>
       </w:r>
     </w:p>
     <w:p>
@@ -4302,7 +4280,7 @@
           <w:sz w:val="20"/>
           <w:szCs w:val="20"/>
         </w:rPr>
-        <w:t xml:space="preserve">C. Estatísticas Globais</w:t>
+        <w:t>C. Estatísticas Globais</w:t>
       </w:r>
     </w:p>
     <w:p>
@@ -4317,7 +4295,7 @@
           <w:sz w:val="20"/>
           <w:szCs w:val="20"/>
         </w:rPr>
-        <w:t xml:space="preserve">A Tab. III resume as estatísticas extraídas do relatório final do simulador.</w:t>
+        <w:t>A Tab. III resume as estatísticas extraídas do relatório final do simulador.</w:t>
       </w:r>
     </w:p>
     <w:p>
@@ -4332,7 +4310,6 @@
           <w:sz w:val="20"/>
           <w:szCs w:val="20"/>
         </w:rPr>
-        <w:t xml:space="preserve"/>
       </w:r>
     </w:p>
     <w:p>
@@ -4348,7 +4325,7 @@
           <w:sz w:val="18"/>
           <w:szCs w:val="18"/>
         </w:rPr>
-        <w:t xml:space="preserve">Tab. III — Estatísticas globais da simulação</w:t>
+        <w:t>Tab. III: Estatísticas globais da simulação</w:t>
       </w:r>
     </w:p>
     <w:tbl>
@@ -4400,7 +4377,7 @@
                 <w:sz w:val="17"/>
                 <w:szCs w:val="17"/>
               </w:rPr>
-              <w:t xml:space="preserve">Métrica</w:t>
+              <w:t>Métrica</w:t>
             </w:r>
           </w:p>
         </w:tc>
@@ -4435,7 +4412,7 @@
                 <w:sz w:val="17"/>
                 <w:szCs w:val="17"/>
               </w:rPr>
-              <w:t xml:space="preserve">Valor</w:t>
+              <w:t>Valor</w:t>
             </w:r>
           </w:p>
         </w:tc>
@@ -4472,7 +4449,7 @@
                 <w:sz w:val="17"/>
                 <w:szCs w:val="17"/>
               </w:rPr>
-              <w:t xml:space="preserve">Pacotes injetados</w:t>
+              <w:t>Pacotes injetados</w:t>
             </w:r>
           </w:p>
         </w:tc>
@@ -4507,7 +4484,7 @@
                 <w:sz w:val="17"/>
                 <w:szCs w:val="17"/>
               </w:rPr>
-              <w:t xml:space="preserve">5</w:t>
+              <w:t>5</w:t>
             </w:r>
           </w:p>
         </w:tc>
@@ -4544,7 +4521,7 @@
                 <w:sz w:val="17"/>
                 <w:szCs w:val="17"/>
               </w:rPr>
-              <w:t xml:space="preserve">Pacotes entregues</w:t>
+              <w:t>Pacotes descartados</w:t>
             </w:r>
           </w:p>
         </w:tc>
@@ -4579,7 +4556,7 @@
                 <w:sz w:val="17"/>
                 <w:szCs w:val="17"/>
               </w:rPr>
-              <w:t xml:space="preserve">5  (100 %)</w:t>
+              <w:t>0</w:t>
             </w:r>
           </w:p>
         </w:tc>
@@ -4616,7 +4593,7 @@
                 <w:sz w:val="17"/>
                 <w:szCs w:val="17"/>
               </w:rPr>
-              <w:t xml:space="preserve">Pacotes descartados</w:t>
+              <w:t>Pacotes entregues</w:t>
             </w:r>
           </w:p>
         </w:tc>
@@ -4651,7 +4628,7 @@
                 <w:sz w:val="17"/>
                 <w:szCs w:val="17"/>
               </w:rPr>
-              <w:t xml:space="preserve">0</w:t>
+              <w:t>5 (100 %)</w:t>
             </w:r>
           </w:p>
         </w:tc>
@@ -4688,7 +4665,7 @@
                 <w:sz w:val="17"/>
                 <w:szCs w:val="17"/>
               </w:rPr>
-              <w:t xml:space="preserve">Latência mínima</w:t>
+              <w:t>Pacotes pendentes</w:t>
             </w:r>
           </w:p>
         </w:tc>
@@ -4723,7 +4700,7 @@
                 <w:sz w:val="17"/>
                 <w:szCs w:val="17"/>
               </w:rPr>
-              <w:t xml:space="preserve">3 ciclos</w:t>
+              <w:t>0</w:t>
             </w:r>
           </w:p>
         </w:tc>
@@ -4760,7 +4737,7 @@
                 <w:sz w:val="17"/>
                 <w:szCs w:val="17"/>
               </w:rPr>
-              <w:t xml:space="preserve">Latência máxima</w:t>
+              <w:t>Latência mínima</w:t>
             </w:r>
           </w:p>
         </w:tc>
@@ -4795,7 +4772,7 @@
                 <w:sz w:val="17"/>
                 <w:szCs w:val="17"/>
               </w:rPr>
-              <w:t xml:space="preserve">3 ciclos</w:t>
+              <w:t>3 ciclos</w:t>
             </w:r>
           </w:p>
         </w:tc>
@@ -4832,7 +4809,7 @@
                 <w:sz w:val="17"/>
                 <w:szCs w:val="17"/>
               </w:rPr>
-              <w:t xml:space="preserve">Latência média</w:t>
+              <w:t>Latência máxima</w:t>
             </w:r>
           </w:p>
         </w:tc>
@@ -4867,7 +4844,7 @@
                 <w:sz w:val="17"/>
                 <w:szCs w:val="17"/>
               </w:rPr>
-              <w:t xml:space="preserve">3,0 ciclos</w:t>
+              <w:t>3 ciclos</w:t>
             </w:r>
           </w:p>
         </w:tc>
@@ -4904,7 +4881,7 @@
                 <w:sz w:val="17"/>
                 <w:szCs w:val="17"/>
               </w:rPr>
-              <w:t xml:space="preserve">Média de saltos (hops)</w:t>
+              <w:t>Latência média</w:t>
             </w:r>
           </w:p>
         </w:tc>
@@ -4939,7 +4916,7 @@
                 <w:sz w:val="17"/>
                 <w:szCs w:val="17"/>
               </w:rPr>
-              <w:t xml:space="preserve">2,0</w:t>
+              <w:t>3,0 ciclos</w:t>
             </w:r>
           </w:p>
         </w:tc>
@@ -4976,7 +4953,7 @@
                 <w:sz w:val="17"/>
                 <w:szCs w:val="17"/>
               </w:rPr>
-              <w:t xml:space="preserve">Throughput</w:t>
+              <w:t>Média de saltos (hops)</w:t>
             </w:r>
           </w:p>
         </w:tc>
@@ -5011,7 +4988,7 @@
                 <w:sz w:val="17"/>
                 <w:szCs w:val="17"/>
               </w:rPr>
-              <w:t xml:space="preserve">0,238 pac./ciclo</w:t>
+              <w:t>2,0</w:t>
             </w:r>
           </w:p>
         </w:tc>
@@ -5048,7 +5025,7 @@
                 <w:sz w:val="17"/>
                 <w:szCs w:val="17"/>
               </w:rPr>
-              <w:t xml:space="preserve">Ciclos simulados</w:t>
+              <w:t>Throughput</w:t>
             </w:r>
           </w:p>
         </w:tc>
@@ -5083,7 +5060,79 @@
                 <w:sz w:val="17"/>
                 <w:szCs w:val="17"/>
               </w:rPr>
-              <w:t xml:space="preserve">20</w:t>
+              <w:t>0,625 pac./ciclo</w:t>
+            </w:r>
+          </w:p>
+        </w:tc>
+      </w:tr>
+      <w:tr>
+        <w:tc>
+          <w:tcPr>
+            <w:tcW w:type="dxa" w:w="2700"/>
+            <w:tcBorders>
+              <w:top w:val="single" w:color="000000" w:sz="4"/>
+              <w:left w:val="single" w:color="000000" w:sz="4"/>
+              <w:bottom w:val="single" w:color="000000" w:sz="4"/>
+              <w:right w:val="single" w:color="000000" w:sz="4"/>
+            </w:tcBorders>
+            <w:shd w:fill="FFFFFF" w:val="clear"/>
+            <w:tcMar>
+              <w:top w:type="dxa" w:w="50"/>
+              <w:left w:type="dxa" w:w="90"/>
+              <w:bottom w:type="dxa" w:w="50"/>
+              <w:right w:type="dxa" w:w="90"/>
+            </w:tcMar>
+          </w:tcPr>
+          <w:p>
+            <w:pPr>
+              <w:jc w:val="left"/>
+            </w:pPr>
+            <w:r>
+              <w:rPr>
+                <w:rFonts w:ascii="Times New Roman" w:cs="Times New Roman" w:eastAsia="Times New Roman" w:hAnsi="Times New Roman"/>
+                <w:b w:val="false"/>
+                <w:bCs w:val="false"/>
+                <w:i w:val="false"/>
+                <w:iCs w:val="false"/>
+                <w:sz w:val="17"/>
+                <w:szCs w:val="17"/>
+              </w:rPr>
+              <w:t>Ciclos simulados</w:t>
+            </w:r>
+          </w:p>
+        </w:tc>
+        <w:tc>
+          <w:tcPr>
+            <w:tcW w:type="dxa" w:w="1400"/>
+            <w:tcBorders>
+              <w:top w:val="single" w:color="000000" w:sz="4"/>
+              <w:left w:val="single" w:color="000000" w:sz="4"/>
+              <w:bottom w:val="single" w:color="000000" w:sz="4"/>
+              <w:right w:val="single" w:color="000000" w:sz="4"/>
+            </w:tcBorders>
+            <w:shd w:fill="FFFFFF" w:val="clear"/>
+            <w:tcMar>
+              <w:top w:type="dxa" w:w="50"/>
+              <w:left w:type="dxa" w:w="90"/>
+              <w:bottom w:type="dxa" w:w="50"/>
+              <w:right w:type="dxa" w:w="90"/>
+            </w:tcMar>
+          </w:tcPr>
+          <w:p>
+            <w:pPr>
+              <w:jc w:val="center"/>
+            </w:pPr>
+            <w:r>
+              <w:rPr>
+                <w:rFonts w:ascii="Times New Roman" w:cs="Times New Roman" w:eastAsia="Times New Roman" w:hAnsi="Times New Roman"/>
+                <w:b w:val="false"/>
+                <w:bCs w:val="false"/>
+                <w:i w:val="false"/>
+                <w:iCs w:val="false"/>
+                <w:sz w:val="17"/>
+                <w:szCs w:val="17"/>
+              </w:rPr>
+              <w:t>7</w:t>
             </w:r>
           </w:p>
         </w:tc>
@@ -5101,7 +5150,6 @@
           <w:sz w:val="20"/>
           <w:szCs w:val="20"/>
         </w:rPr>
-        <w:t xml:space="preserve"/>
       </w:r>
     </w:p>
     <w:p>
@@ -5119,7 +5167,7 @@
           <w:sz w:val="20"/>
           <w:szCs w:val="20"/>
         </w:rPr>
-        <w:t xml:space="preserve">D. Trecho do Log de Simulação</w:t>
+        <w:t>D. Trecho do Log de Simulação</w:t>
       </w:r>
     </w:p>
     <w:p>
@@ -5134,7 +5182,7 @@
           <w:sz w:val="20"/>
           <w:szCs w:val="20"/>
         </w:rPr>
-        <w:t xml:space="preserve">O trecho abaixo, referente ao ciclo 3, ilustra a entrega do pacote P0 e o paralelismo de operações dentro de um único ciclo:</w:t>
+        <w:t>O trecho abaixo, referente ao ciclo 3, ilustra a entrega do pacote P0 e o processamento de mais de uma operação dentro do mesmo ciclo:</w:t>
       </w:r>
     </w:p>
     <w:p>
@@ -5149,7 +5197,6 @@
           <w:sz w:val="20"/>
           <w:szCs w:val="20"/>
         </w:rPr>
-        <w:t xml:space="preserve"/>
       </w:r>
     </w:p>
     <w:p>
@@ -5163,7 +5210,7 @@
           <w:sz w:val="16"/>
           <w:szCs w:val="16"/>
         </w:rPr>
-        <w:t xml:space="preserve">======== CICLO 3 ========</w:t>
+        <w:t>======== CICLO 3 ========</w:t>
       </w:r>
     </w:p>
     <w:p>
@@ -5177,7 +5224,7 @@
           <w:sz w:val="16"/>
           <w:szCs w:val="16"/>
         </w:rPr>
-        <w:t xml:space="preserve">[R3] DN2 sobe P2 -&gt; R4 (U0, credito=3)</w:t>
+        <w:t>[R3] DN2 sobe P2 -&gt; R4 (U0)</w:t>
       </w:r>
     </w:p>
     <w:p>
@@ -5191,7 +5238,7 @@
           <w:sz w:val="16"/>
           <w:szCs w:val="16"/>
         </w:rPr>
-        <w:t xml:space="preserve">[R3] UP0 entrega P0 ao terminal T15</w:t>
+        <w:t>[R3] UP0 entrega P0 ao terminal T15</w:t>
       </w:r>
     </w:p>
     <w:p>
@@ -5205,7 +5252,7 @@
           <w:sz w:val="16"/>
           <w:szCs w:val="16"/>
         </w:rPr>
-        <w:t xml:space="preserve">[R4] DN1 desce P1 -&gt; R2 (D2, credito=3)</w:t>
+        <w:t>[R4] DN1 desce P1 -&gt; R2 (D2)</w:t>
       </w:r>
     </w:p>
     <w:p>
@@ -5219,7 +5266,7 @@
           <w:sz w:val="16"/>
           <w:szCs w:val="16"/>
         </w:rPr>
-        <w:t xml:space="preserve">&gt;&gt;&gt; P0 ENTREGUE ao T15 em R3</w:t>
+        <w:t>&gt;&gt;&gt; P0 ENTREGUE ao T15 em R3</w:t>
       </w:r>
     </w:p>
     <w:p>
@@ -5248,7 +5295,6 @@
           <w:sz w:val="20"/>
           <w:szCs w:val="20"/>
         </w:rPr>
-        <w:t xml:space="preserve"/>
       </w:r>
     </w:p>
     <w:p>
@@ -5263,7 +5309,7 @@
           <w:sz w:val="20"/>
           <w:szCs w:val="20"/>
         </w:rPr>
-        <w:t xml:space="preserve">R3 processa simultaneamente a subida de P2 (via DN2) e a entrega de P0 (via UP0), evidenciando o paralelismo intraciclo do simulador. A latência de 3 ciclos é o mínimo teórico para a topologia: 2 hops de roteamento mais 1 ciclo de pipeline de buffers.</w:t>
+        <w:t>R3 processa a subida de P2 (via DN2) e a entrega de P0 (via UP0) no mesmo ciclo de simulação. A latência de 3 ciclos no cenário principal corresponde a 2 saltos de roteamento entre roteadores e uma etapa adicional de entrega do pacote ao terminal de destino.</w:t>
       </w:r>
     </w:p>
     <w:p>
@@ -5279,7 +5325,7 @@
           <w:sz w:val="20"/>
           <w:szCs w:val="20"/>
         </w:rPr>
-        <w:t xml:space="preserve">V. CONCLUSÃO</w:t>
+        <w:t>V. CONCLUSÃO</w:t>
       </w:r>
     </w:p>
     <w:p>
@@ -5294,7 +5340,7 @@
           <w:sz w:val="20"/>
           <w:szCs w:val="20"/>
         </w:rPr>
-        <w:t xml:space="preserve">Este trabalho desenvolveu e validou um simulador de Rede em Chip baseado na arquitetura SPIN implementado em C++17 com SystemC 3.0. A topologia de árvore gorda quaternária com 8 roteadores RSPIN e 16 terminais foi modelada fielmente com os mecanismos de chaveamento Wormhole, controle de fluxo por créditos (com buffers de 4 palavras/porta e centrais de 18 palavras), roteamento adaptativo na subida e determinístico na descida, e arbitragem Round-Robin.</w:t>
+        <w:t>Este trabalho desenvolveu e validou um simulador de Rede em Chip inspirado na arquitetura SPIN, implementado em C++17 com SystemC. A topologia de árvore gorda quaternária simplificada com 8 roteadores RSPIN e 16 terminais foi representada com conexões ponto-a-ponto entre roteadores folha e roteadores de topo. O modelo considera pacotes em nível abstrato, buffers por porta, buffers centrais QUP e QDN para overflow e controle de fluxo simplificado por capacidade de buffer.</w:t>
       </w:r>
     </w:p>
     <w:p>
@@ -5309,7 +5355,6 @@
           <w:sz w:val="20"/>
           <w:szCs w:val="20"/>
         </w:rPr>
-        <w:t xml:space="preserve"/>
       </w:r>
     </w:p>
     <w:p>
@@ -5324,7 +5369,7 @@
           <w:sz w:val="20"/>
           <w:szCs w:val="20"/>
         </w:rPr>
-        <w:t xml:space="preserve">Os resultados confirmaram a operação correta do modelo: todos os 5 pacotes foram entregues sem descartes, com latência de 3 ciclos (valor teórico mínimo para a topologia) e 2 saltos por mensagem. O roteamento adaptativo demonstrou balanceamento de carga ao selecionar R5 para P3 enquanto R4 estava ocupado. O uso de buffers duplos (current_/next_) garantiu consistência na simulação paralela dos roteadores.</w:t>
+        <w:t>Os resultados confirmaram a operação correta do modelo no cenário principal: todos os 5 pacotes foram entregues sem descartes ou pendentes, com latência de 3 ciclos e 2 saltos de roteamento por mensagem. No cenário de estresse, o simulador também entregou todos os 15 pacotes, sem descartes e sem pendentes, com latência média de 4,4 ciclos, demonstrando que os buffers centrais são reprocessados corretamente em situações de maior contenção.</w:t>
       </w:r>
     </w:p>
     <w:p>
@@ -5339,7 +5384,6 @@
           <w:sz w:val="20"/>
           <w:szCs w:val="20"/>
         </w:rPr>
-        <w:t xml:space="preserve"/>
       </w:r>
     </w:p>
     <w:p>
@@ -5354,7 +5398,7 @@
           <w:sz w:val="20"/>
           <w:szCs w:val="20"/>
         </w:rPr>
-        <w:t xml:space="preserve">Como trabalhos futuros, propõe-se a avaliação com cenários de tráfego intenso e com contenção simultânea, para estressar os mecanismos de controle de fluxo e quantificar a degradação de desempenho sob congestionamento. A extensão para topologias com mais níveis e maior número de roteadores também constitui direção natural de continuidade.</w:t>
+        <w:t>Como trabalhos futuros, propõe-se a implementação de flits reais para representar chaveamento Wormhole com maior fidelidade, controle de fluxo por créditos em nível de canal, arbitragem Round-Robin completa por porta de saída, geração de formas de onda VCD e extensão para topologias com mais níveis e maior número de roteadores.</w:t>
       </w:r>
     </w:p>
     <w:p>
@@ -5370,7 +5414,7 @@
           <w:sz w:val="20"/>
           <w:szCs w:val="20"/>
         </w:rPr>
-        <w:t xml:space="preserve">REFERÊNCIAS</w:t>
+        <w:t>REFERÊNCIAS</w:t>
       </w:r>
     </w:p>
     <w:p>
@@ -5405,15 +5449,15 @@
           <w:sz w:val="20"/>
           <w:szCs w:val="20"/>
         </w:rPr>
-        <w:t xml:space="preserve">Principles and Practices of Interconnection Networks</w:t>
-      </w:r>
-      <w:r>
-        <w:rPr>
-          <w:rFonts w:ascii="Times New Roman" w:cs="Times New Roman" w:eastAsia="Times New Roman" w:hAnsi="Times New Roman"/>
-          <w:sz w:val="20"/>
-          <w:szCs w:val="20"/>
-        </w:rPr>
-        <w:t xml:space="preserve">. San Francisco: Morgan Kaufmann, 2004.</w:t>
+        <w:t>Principles and Practices of Interconnection Networks</w:t>
+      </w:r>
+      <w:r>
+        <w:rPr>
+          <w:rFonts w:ascii="Times New Roman" w:cs="Times New Roman" w:eastAsia="Times New Roman" w:hAnsi="Times New Roman"/>
+          <w:sz w:val="20"/>
+          <w:szCs w:val="20"/>
+        </w:rPr>
+        <w:t>. San Francisco: Morgan Kaufmann, 2004.</w:t>
       </w:r>
     </w:p>
     <w:p>
@@ -5448,15 +5492,15 @@
           <w:sz w:val="20"/>
           <w:szCs w:val="20"/>
         </w:rPr>
-        <w:t xml:space="preserve">Proc. Euromicro Conf. Digital System Design</w:t>
-      </w:r>
-      <w:r>
-        <w:rPr>
-          <w:rFonts w:ascii="Times New Roman" w:cs="Times New Roman" w:eastAsia="Times New Roman" w:hAnsi="Times New Roman"/>
-          <w:sz w:val="20"/>
-          <w:szCs w:val="20"/>
-        </w:rPr>
-        <w:t xml:space="preserve">, Warsaw, 2001, pp. 102–109.</w:t>
+        <w:t>Proc. Euromicro Conf. Digital System Design</w:t>
+      </w:r>
+      <w:r>
+        <w:rPr>
+          <w:rFonts w:ascii="Times New Roman" w:cs="Times New Roman" w:eastAsia="Times New Roman" w:hAnsi="Times New Roman"/>
+          <w:sz w:val="20"/>
+          <w:szCs w:val="20"/>
+        </w:rPr>
+        <w:t>, Warsaw, 2001, pp. 102-109.</w:t>
       </w:r>
     </w:p>
     <w:p>
@@ -5491,15 +5535,15 @@
           <w:sz w:val="20"/>
           <w:szCs w:val="20"/>
         </w:rPr>
-        <w:t xml:space="preserve">IEEE Computer</w:t>
-      </w:r>
-      <w:r>
-        <w:rPr>
-          <w:rFonts w:ascii="Times New Roman" w:cs="Times New Roman" w:eastAsia="Times New Roman" w:hAnsi="Times New Roman"/>
-          <w:sz w:val="20"/>
-          <w:szCs w:val="20"/>
-        </w:rPr>
-        <w:t xml:space="preserve">, vol. 35, n. 1, pp. 70–78, jan. 2002.</w:t>
+        <w:t>IEEE Computer</w:t>
+      </w:r>
+      <w:r>
+        <w:rPr>
+          <w:rFonts w:ascii="Times New Roman" w:cs="Times New Roman" w:eastAsia="Times New Roman" w:hAnsi="Times New Roman"/>
+          <w:sz w:val="20"/>
+          <w:szCs w:val="20"/>
+        </w:rPr>
+        <w:t>, vol. 35, n. 1, pp. 70-78, jan. 2002.</w:t>
       </w:r>
     </w:p>
     <w:p>
@@ -5516,15 +5560,14 @@
           <w:sz w:val="20"/>
           <w:szCs w:val="20"/>
         </w:rPr>
-        <w:t xml:space="preserve">[4] </w:t>
-      </w:r>
-      <w:r>
-        <w:rPr>
-          <w:rFonts w:ascii="Times New Roman" w:cs="Times New Roman" w:eastAsia="Times New Roman" w:hAnsi="Times New Roman"/>
-          <w:sz w:val="20"/>
-          <w:szCs w:val="20"/>
-        </w:rPr>
-        <w:t xml:space="preserve">IEEE, </w:t>
+        <w:t>[4] IEEE, IEEE Std 1666-2023: Standard for Standard SystemC Language Reference Manual. New York: IEEE, 2023.</w:t>
+      </w:r>
+      <w:r>
+        <w:rPr>
+          <w:rFonts w:ascii="Times New Roman" w:cs="Times New Roman" w:eastAsia="Times New Roman" w:hAnsi="Times New Roman"/>
+          <w:sz w:val="20"/>
+          <w:szCs w:val="20"/>
+        </w:rPr>
       </w:r>
       <w:r>
         <w:rPr>
@@ -5534,15 +5577,13 @@
           <w:sz w:val="20"/>
           <w:szCs w:val="20"/>
         </w:rPr>
-        <w:t xml:space="preserve">IEEE Std 1666-2011: Standard SystemC Language Reference Manual</w:t>
-      </w:r>
-      <w:r>
-        <w:rPr>
-          <w:rFonts w:ascii="Times New Roman" w:cs="Times New Roman" w:eastAsia="Times New Roman" w:hAnsi="Times New Roman"/>
-          <w:sz w:val="20"/>
-          <w:szCs w:val="20"/>
-        </w:rPr>
-        <w:t xml:space="preserve">. New York: IEEE, 2012.</w:t>
+      </w:r>
+      <w:r>
+        <w:rPr>
+          <w:rFonts w:ascii="Times New Roman" w:cs="Times New Roman" w:eastAsia="Times New Roman" w:hAnsi="Times New Roman"/>
+          <w:sz w:val="20"/>
+          <w:szCs w:val="20"/>
+        </w:rPr>
       </w:r>
     </w:p>
     <w:p>
@@ -5559,15 +5600,13 @@
           <w:sz w:val="20"/>
           <w:szCs w:val="20"/>
         </w:rPr>
-        <w:t xml:space="preserve">[5] </w:t>
-      </w:r>
-      <w:r>
-        <w:rPr>
-          <w:rFonts w:ascii="Times New Roman" w:cs="Times New Roman" w:eastAsia="Times New Roman" w:hAnsi="Times New Roman"/>
-          <w:sz w:val="20"/>
-          <w:szCs w:val="20"/>
-        </w:rPr>
-        <w:t xml:space="preserve">Accellera Systems Initiative, “SystemC 3.0 Release Notes,” 2025. [Online]. Disponível em: https://systemc.org. Acesso em: jun. 2026.</w:t>
+      </w:r>
+      <w:r>
+        <w:rPr>
+          <w:rFonts w:ascii="Times New Roman" w:cs="Times New Roman" w:eastAsia="Times New Roman" w:hAnsi="Times New Roman"/>
+          <w:sz w:val="20"/>
+          <w:szCs w:val="20"/>
+        </w:rPr>
       </w:r>
     </w:p>
     <w:sectPr>

</xml_diff>